<commit_message>
Correct and validate Guide 63 publication files
</commit_message>
<xml_diff>
--- a/63-library-assistant-and-library-technician/english/docx/Library Assistant and Library Technician.docx
+++ b/63-library-assistant-and-library-technician/english/docx/Library Assistant and Library Technician.docx
@@ -12,7 +12,7 @@
           <w:color w:val="1F4E79"/>
           <w:sz w:val="26"/>
         </w:rPr>
-        <w:t>LIFELONG OPPORTUNITY</w:t>
+        <w:t>LIFELONG OPPORTUNITY | GUIDE 63</w:t>
       </w:r>
     </w:p>
     <w:p>
@@ -4016,7 +4016,7 @@
         <w:color w:val="595959"/>
         <w:sz w:val="16"/>
       </w:rPr>
-      <w:t>Lifelong Opportunity Guides | Library Assistant and Library Technician Guide v1.0</w:t>
+      <w:t>Lifelong Opportunity Guides | Guide 63 | Library Assistant and Library Technician v1.0</w:t>
     </w:r>
   </w:p>
 </w:hdr>

</xml_diff>